<commit_message>
Add final activity evidence
</commit_message>
<xml_diff>
--- a/Part 2/B14/B14_Reflection.docx
+++ b/Part 2/B14/B14_Reflection.docx
@@ -21,7 +21,27 @@
           <w:bCs w:val="0"/>
           <w:color w:val="000000"/>
         </w:rPr>
-        <w:t xml:space="preserve">B26: </w:t>
+        <w:t>B</w:t>
+      </w:r>
+      <w:r>
+        <w:rPr>
+          <w:rStyle w:val="Strong"/>
+          <w:rFonts w:eastAsiaTheme="majorEastAsia"/>
+          <w:b w:val="0"/>
+          <w:bCs w:val="0"/>
+          <w:color w:val="000000"/>
+        </w:rPr>
+        <w:t>14</w:t>
+      </w:r>
+      <w:r>
+        <w:rPr>
+          <w:rStyle w:val="Strong"/>
+          <w:rFonts w:eastAsiaTheme="majorEastAsia"/>
+          <w:b w:val="0"/>
+          <w:bCs w:val="0"/>
+          <w:color w:val="000000"/>
+        </w:rPr>
+        <w:t xml:space="preserve">: </w:t>
       </w:r>
       <w:r>
         <w:t>Teach friends about a cybersecurity topic</w:t>

</xml_diff>